<commit_message>
updata subbti button and edit color
</commit_message>
<xml_diff>
--- a/public/React_Project_Quotation (1).docx
+++ b/public/React_Project_Quotation (1).docx
@@ -1,6 +1,6 @@
 
 <file path=word/document.xml><?xml version="1.0" encoding="utf-8"?>
-<w:document xmlns:wpc="http://schemas.microsoft.com/office/word/2010/wordprocessingCanvas" xmlns:mo="http://schemas.microsoft.com/office/mac/office/2008/main" xmlns:mc="http://schemas.openxmlformats.org/markup-compatibility/2006" xmlns:mv="urn:schemas-microsoft-com:mac:vml" xmlns:o="urn:schemas-microsoft-com:office:office" xmlns:r="http://schemas.openxmlformats.org/officeDocument/2006/relationships" xmlns:m="http://schemas.openxmlformats.org/officeDocument/2006/math" xmlns:v="urn:schemas-microsoft-com:vml" xmlns:wp14="http://schemas.microsoft.com/office/word/2010/wordprocessingDrawing" xmlns:wp="http://schemas.openxmlformats.org/drawingml/2006/wordprocessingDrawing" xmlns:w10="urn:schemas-microsoft-com:office:word" xmlns:w="http://schemas.openxmlformats.org/wordprocessingml/2006/main" xmlns:w14="http://schemas.microsoft.com/office/word/2010/wordml" xmlns:wpg="http://schemas.microsoft.com/office/word/2010/wordprocessingGroup" xmlns:wpi="http://schemas.microsoft.com/office/word/2010/wordprocessingInk" xmlns:wne="http://schemas.microsoft.com/office/word/2006/wordml" xmlns:wps="http://schemas.microsoft.com/office/word/2010/wordprocessingShape" mc:Ignorable="w14 wp14">
+<w:document xmlns:wpc="http://schemas.microsoft.com/office/word/2010/wordprocessingCanvas" xmlns:mc="http://schemas.openxmlformats.org/markup-compatibility/2006" xmlns:o="urn:schemas-microsoft-com:office:office" xmlns:r="http://schemas.openxmlformats.org/officeDocument/2006/relationships" xmlns:m="http://schemas.openxmlformats.org/officeDocument/2006/math" xmlns:v="urn:schemas-microsoft-com:vml" xmlns:wp14="http://schemas.microsoft.com/office/word/2010/wordprocessingDrawing" xmlns:wp="http://schemas.openxmlformats.org/drawingml/2006/wordprocessingDrawing" xmlns:w10="urn:schemas-microsoft-com:office:word" xmlns:w="http://schemas.openxmlformats.org/wordprocessingml/2006/main" xmlns:w14="http://schemas.microsoft.com/office/word/2010/wordml" xmlns:wpg="http://schemas.microsoft.com/office/word/2010/wordprocessingGroup" xmlns:wpi="http://schemas.microsoft.com/office/word/2010/wordprocessingInk" xmlns:wne="http://schemas.microsoft.com/office/word/2006/wordml" xmlns:wps="http://schemas.microsoft.com/office/word/2010/wordprocessingShape" mc:Ignorable="w14 wp14">
   <w:body>
     <w:p>
       <w:r>
@@ -33,7 +33,15 @@
     </w:p>
     <w:p>
       <w:r>
-        <w:t>The website will be developed using React + TypeScript + Tailwind CSS with Vite setup. It will include responsive UI/UX design, form handling with validation, file upload/download functionality, and GitHub CI/CD integration for continuous deployment. The website will be hosted on Netlify/Vercel (recommended) and integrated with your existing GoDaddy domain.</w:t>
+        <w:t xml:space="preserve">The website will be developed using React + TypeScript + Tailwind CSS with Vite setup. It will include responsive UI/UX design, form handling with validation, file </w:t>
+      </w:r>
+      <w:r>
+        <w:t>upload/download functionality, and GitHub CI/CD integration for continuous deployment. The website will be hosted on Netlify/Vercel (recommended) and integrated with your existing GoDaddy do</w:t>
+      </w:r>
+      <w:bookmarkStart w:id="0" w:name="_GoBack"/>
+      <w:bookmarkEnd w:id="0"/>
+      <w:r>
+        <w:t>main.</w:t>
       </w:r>
     </w:p>
     <w:p/>
@@ -47,8 +55,8 @@
     </w:p>
     <w:tbl>
       <w:tblPr>
-        <w:tblW w:type="auto" w:w="0"/>
-        <w:tblLook w:firstColumn="1" w:firstRow="1" w:lastColumn="0" w:lastRow="0" w:noHBand="0" w:noVBand="1" w:val="04A0"/>
+        <w:tblW w:w="0" w:type="auto"/>
+        <w:tblLook w:val="04A0" w:firstRow="1" w:lastRow="0" w:firstColumn="1" w:lastColumn="0" w:noHBand="0" w:noVBand="1"/>
       </w:tblPr>
       <w:tblGrid>
         <w:gridCol w:w="2880"/>
@@ -58,7 +66,7 @@
       <w:tr>
         <w:tc>
           <w:tcPr>
-            <w:tcW w:type="dxa" w:w="2880"/>
+            <w:tcW w:w="2880" w:type="dxa"/>
           </w:tcPr>
           <w:p>
             <w:r>
@@ -68,7 +76,7 @@
         </w:tc>
         <w:tc>
           <w:tcPr>
-            <w:tcW w:type="dxa" w:w="2880"/>
+            <w:tcW w:w="2880" w:type="dxa"/>
           </w:tcPr>
           <w:p>
             <w:r>
@@ -78,7 +86,7 @@
         </w:tc>
         <w:tc>
           <w:tcPr>
-            <w:tcW w:type="dxa" w:w="2880"/>
+            <w:tcW w:w="2880" w:type="dxa"/>
           </w:tcPr>
           <w:p>
             <w:r>
@@ -90,7 +98,7 @@
       <w:tr>
         <w:tc>
           <w:tcPr>
-            <w:tcW w:type="dxa" w:w="2880"/>
+            <w:tcW w:w="2880" w:type="dxa"/>
           </w:tcPr>
           <w:p>
             <w:r>
@@ -100,7 +108,7 @@
         </w:tc>
         <w:tc>
           <w:tcPr>
-            <w:tcW w:type="dxa" w:w="2880"/>
+            <w:tcW w:w="2880" w:type="dxa"/>
           </w:tcPr>
           <w:p>
             <w:r>
@@ -110,11 +118,17 @@
         </w:tc>
         <w:tc>
           <w:tcPr>
-            <w:tcW w:type="dxa" w:w="2880"/>
+            <w:tcW w:w="2880" w:type="dxa"/>
           </w:tcPr>
           <w:p>
             <w:r>
-              <w:t>₹30,000/-</w:t>
+              <w:t>₹</w:t>
+            </w:r>
+            <w:r>
+              <w:t>25</w:t>
+            </w:r>
+            <w:r>
+              <w:t>,000/-</w:t>
             </w:r>
           </w:p>
         </w:tc>
@@ -122,7 +136,7 @@
       <w:tr>
         <w:tc>
           <w:tcPr>
-            <w:tcW w:type="dxa" w:w="2880"/>
+            <w:tcW w:w="2880" w:type="dxa"/>
           </w:tcPr>
           <w:p>
             <w:r>
@@ -132,7 +146,7 @@
         </w:tc>
         <w:tc>
           <w:tcPr>
-            <w:tcW w:type="dxa" w:w="2880"/>
+            <w:tcW w:w="2880" w:type="dxa"/>
           </w:tcPr>
           <w:p>
             <w:r>
@@ -142,11 +156,17 @@
         </w:tc>
         <w:tc>
           <w:tcPr>
-            <w:tcW w:type="dxa" w:w="2880"/>
+            <w:tcW w:w="2880" w:type="dxa"/>
           </w:tcPr>
           <w:p>
             <w:r>
-              <w:t>₹0 – ₹12,000/-</w:t>
+              <w:t>₹</w:t>
+            </w:r>
+            <w:r>
+              <w:t>0 – ₹5</w:t>
+            </w:r>
+            <w:r>
+              <w:t>,000/-</w:t>
             </w:r>
           </w:p>
         </w:tc>
@@ -154,7 +174,7 @@
       <w:tr>
         <w:tc>
           <w:tcPr>
-            <w:tcW w:type="dxa" w:w="2880"/>
+            <w:tcW w:w="2880" w:type="dxa"/>
           </w:tcPr>
           <w:p>
             <w:r>
@@ -164,7 +184,7 @@
         </w:tc>
         <w:tc>
           <w:tcPr>
-            <w:tcW w:type="dxa" w:w="2880"/>
+            <w:tcW w:w="2880" w:type="dxa"/>
           </w:tcPr>
           <w:p>
             <w:r>
@@ -174,11 +194,17 @@
         </w:tc>
         <w:tc>
           <w:tcPr>
-            <w:tcW w:type="dxa" w:w="2880"/>
+            <w:tcW w:w="2880" w:type="dxa"/>
           </w:tcPr>
           <w:p>
             <w:r>
-              <w:t>₹15,000/-</w:t>
+              <w:t>₹</w:t>
+            </w:r>
+            <w:r>
+              <w:t>12</w:t>
+            </w:r>
+            <w:r>
+              <w:t>,000/-</w:t>
             </w:r>
           </w:p>
         </w:tc>
@@ -190,22 +216,57 @@
         <w:pStyle w:val="Heading2"/>
       </w:pPr>
       <w:r>
-        <w:t>Final Costing (First Year)</w:t>
+        <w:t xml:space="preserve">Final Costing </w:t>
+      </w:r>
+      <w:r>
+        <w:t>(First Year)</w:t>
       </w:r>
     </w:p>
     <w:p>
       <w:r>
-        <w:t>- If hosted on Free Netlify/Vercel → ₹45,000/-</w:t>
+        <w:t>- If hosted on Paid Hosting (</w:t>
+      </w:r>
+      <w:proofErr w:type="spellStart"/>
+      <w:r>
+        <w:t>G</w:t>
+      </w:r>
+      <w:r>
+        <w:t>oDaddy</w:t>
+      </w:r>
+      <w:proofErr w:type="spellEnd"/>
+      <w:r>
+        <w:t xml:space="preserve"> </w:t>
+      </w:r>
+      <w:proofErr w:type="spellStart"/>
+      <w:r>
+        <w:t>cPanel</w:t>
+      </w:r>
+      <w:proofErr w:type="spellEnd"/>
+      <w:r>
+        <w:t>/</w:t>
+      </w:r>
+      <w:proofErr w:type="spellStart"/>
+      <w:r>
+        <w:t>Netlify</w:t>
+      </w:r>
+      <w:proofErr w:type="spellEnd"/>
+      <w:r>
+        <w:t xml:space="preserve"> Pro) → ₹42</w:t>
+      </w:r>
+      <w:r>
+        <w:t>,000/-</w:t>
+      </w:r>
+      <w:r>
         <w:br/>
-        <w:t>- If hosted on Paid Hosting (GoDaddy cPanel/Netlify Pro) → ₹57,000/-</w:t>
+      </w:r>
+      <w:r>
         <w:br/>
-        <w:br/>
-        <w:t>(From second year onwards, only yearly maintenance charges of ₹15,000/- will apply, excluding optional hosting charges.)</w:t>
       </w:r>
-    </w:p>
-    <w:p>
       <w:r>
-        <w:t>Date: [Insert Date]</w:t>
+        <w:t>Date:</w:t>
+      </w:r>
+      <w:r>
+        <w:t xml:space="preserve"> [Insert Date]</w:t>
       </w:r>
     </w:p>
     <w:p>
@@ -229,7 +290,7 @@
 </file>
 
 <file path=word/numbering.xml><?xml version="1.0" encoding="utf-8"?>
-<w:numbering xmlns:wpc="http://schemas.microsoft.com/office/word/2010/wordprocessingCanvas" xmlns:mo="http://schemas.microsoft.com/office/mac/office/2008/main" xmlns:mc="http://schemas.openxmlformats.org/markup-compatibility/2006" xmlns:mv="urn:schemas-microsoft-com:mac:vml" xmlns:o="urn:schemas-microsoft-com:office:office" xmlns:r="http://schemas.openxmlformats.org/officeDocument/2006/relationships" xmlns:m="http://schemas.openxmlformats.org/officeDocument/2006/math" xmlns:v="urn:schemas-microsoft-com:vml" xmlns:wp14="http://schemas.microsoft.com/office/word/2010/wordprocessingDrawing" xmlns:wp="http://schemas.openxmlformats.org/drawingml/2006/wordprocessingDrawing" xmlns:w10="urn:schemas-microsoft-com:office:word" xmlns:w="http://schemas.openxmlformats.org/wordprocessingml/2006/main" xmlns:w14="http://schemas.microsoft.com/office/word/2010/wordml" xmlns:wpg="http://schemas.microsoft.com/office/word/2010/wordprocessingGroup" xmlns:wpi="http://schemas.microsoft.com/office/word/2010/wordprocessingInk" xmlns:wne="http://schemas.microsoft.com/office/word/2006/wordml" xmlns:wps="http://schemas.microsoft.com/office/word/2010/wordprocessingShape" mc:Ignorable="w14 wp14">
+<w:numbering xmlns:wpc="http://schemas.microsoft.com/office/word/2010/wordprocessingCanvas" xmlns:mc="http://schemas.openxmlformats.org/markup-compatibility/2006" xmlns:o="urn:schemas-microsoft-com:office:office" xmlns:r="http://schemas.openxmlformats.org/officeDocument/2006/relationships" xmlns:m="http://schemas.openxmlformats.org/officeDocument/2006/math" xmlns:v="urn:schemas-microsoft-com:vml" xmlns:wp14="http://schemas.microsoft.com/office/word/2010/wordprocessingDrawing" xmlns:wp="http://schemas.openxmlformats.org/drawingml/2006/wordprocessingDrawing" xmlns:w10="urn:schemas-microsoft-com:office:word" xmlns:w="http://schemas.openxmlformats.org/wordprocessingml/2006/main" xmlns:w14="http://schemas.microsoft.com/office/word/2010/wordml" xmlns:wpg="http://schemas.microsoft.com/office/word/2010/wordprocessingGroup" xmlns:wpi="http://schemas.microsoft.com/office/word/2010/wordprocessingInk" xmlns:wne="http://schemas.microsoft.com/office/word/2006/wordml" xmlns:wps="http://schemas.microsoft.com/office/word/2010/wordprocessingShape" mc:Ignorable="w14 wp14">
   <w:abstractNum w:abstractNumId="0">
     <w:nsid w:val="FFFFFF7C"/>
     <w:multiLevelType w:val="singleLevel"/>
@@ -448,7 +509,7 @@
       </w:pPr>
     </w:pPrDefault>
   </w:docDefaults>
-  <w:latentStyles w:defLockedState="0" w:defUIPriority="99" w:defSemiHidden="1" w:defUnhideWhenUsed="1" w:defQFormat="0" w:count="276">
+  <w:latentStyles w:defLockedState="0" w:defUIPriority="99" w:defSemiHidden="1" w:defUnhideWhenUsed="1" w:defQFormat="0" w:count="267">
     <w:lsdException w:name="Normal" w:semiHidden="0" w:uiPriority="0" w:unhideWhenUsed="0" w:qFormat="1"/>
     <w:lsdException w:name="heading 1" w:semiHidden="0" w:uiPriority="9" w:unhideWhenUsed="0" w:qFormat="1"/>
     <w:lsdException w:name="heading 2" w:uiPriority="9" w:qFormat="1"/>
@@ -592,50 +653,6 @@
     <w:qFormat/>
     <w:rsid w:val="00FC693F"/>
   </w:style>
-  <w:style w:type="paragraph" w:styleId="Header">
-    <w:name w:val="header"/>
-    <w:basedOn w:val="Normal"/>
-    <w:link w:val="HeaderChar"/>
-    <w:uiPriority w:val="99"/>
-    <w:unhideWhenUsed/>
-    <w:rsid w:val="00E618BF"/>
-    <w:pPr>
-      <w:tabs>
-        <w:tab w:val="center" w:pos="4680"/>
-        <w:tab w:val="right" w:pos="9360"/>
-      </w:tabs>
-      <w:spacing w:after="0" w:line="240" w:lineRule="auto"/>
-    </w:pPr>
-  </w:style>
-  <w:style w:type="character" w:customStyle="1" w:styleId="HeaderChar">
-    <w:name w:val="Header Char"/>
-    <w:basedOn w:val="DefaultParagraphFont"/>
-    <w:link w:val="Header"/>
-    <w:uiPriority w:val="99"/>
-    <w:rsid w:val="00E618BF"/>
-  </w:style>
-  <w:style w:type="paragraph" w:styleId="Footer">
-    <w:name w:val="footer"/>
-    <w:basedOn w:val="Normal"/>
-    <w:link w:val="FooterChar"/>
-    <w:uiPriority w:val="99"/>
-    <w:unhideWhenUsed/>
-    <w:rsid w:val="00E618BF"/>
-    <w:pPr>
-      <w:tabs>
-        <w:tab w:val="center" w:pos="4680"/>
-        <w:tab w:val="right" w:pos="9360"/>
-      </w:tabs>
-      <w:spacing w:after="0" w:line="240" w:lineRule="auto"/>
-    </w:pPr>
-  </w:style>
-  <w:style w:type="character" w:customStyle="1" w:styleId="FooterChar">
-    <w:name w:val="Footer Char"/>
-    <w:basedOn w:val="DefaultParagraphFont"/>
-    <w:link w:val="Footer"/>
-    <w:uiPriority w:val="99"/>
-    <w:rsid w:val="00E618BF"/>
-  </w:style>
   <w:style w:type="paragraph" w:styleId="Heading1">
     <w:name w:val="heading 1"/>
     <w:basedOn w:val="Normal"/>
@@ -871,6 +888,50 @@
     <w:uiPriority w:val="99"/>
     <w:semiHidden/>
     <w:unhideWhenUsed/>
+  </w:style>
+  <w:style w:type="paragraph" w:styleId="Header">
+    <w:name w:val="header"/>
+    <w:basedOn w:val="Normal"/>
+    <w:link w:val="HeaderChar"/>
+    <w:uiPriority w:val="99"/>
+    <w:unhideWhenUsed/>
+    <w:rsid w:val="00E618BF"/>
+    <w:pPr>
+      <w:tabs>
+        <w:tab w:val="center" w:pos="4680"/>
+        <w:tab w:val="right" w:pos="9360"/>
+      </w:tabs>
+      <w:spacing w:after="0" w:line="240" w:lineRule="auto"/>
+    </w:pPr>
+  </w:style>
+  <w:style w:type="character" w:customStyle="1" w:styleId="HeaderChar">
+    <w:name w:val="Header Char"/>
+    <w:basedOn w:val="DefaultParagraphFont"/>
+    <w:link w:val="Header"/>
+    <w:uiPriority w:val="99"/>
+    <w:rsid w:val="00E618BF"/>
+  </w:style>
+  <w:style w:type="paragraph" w:styleId="Footer">
+    <w:name w:val="footer"/>
+    <w:basedOn w:val="Normal"/>
+    <w:link w:val="FooterChar"/>
+    <w:uiPriority w:val="99"/>
+    <w:unhideWhenUsed/>
+    <w:rsid w:val="00E618BF"/>
+    <w:pPr>
+      <w:tabs>
+        <w:tab w:val="center" w:pos="4680"/>
+        <w:tab w:val="right" w:pos="9360"/>
+      </w:tabs>
+      <w:spacing w:after="0" w:line="240" w:lineRule="auto"/>
+    </w:pPr>
+  </w:style>
+  <w:style w:type="character" w:customStyle="1" w:styleId="FooterChar">
+    <w:name w:val="Footer Char"/>
+    <w:basedOn w:val="DefaultParagraphFont"/>
+    <w:link w:val="Footer"/>
+    <w:uiPriority w:val="99"/>
+    <w:rsid w:val="00E618BF"/>
   </w:style>
   <w:style w:type="paragraph" w:styleId="NoSpacing">
     <w:name w:val="No Spacing"/>
@@ -12278,7 +12339,7 @@
 </file>
 
 <file path=word/stylesWithEffects.xml><?xml version="1.0" encoding="utf-8"?>
-<w:styles xmlns:wpc="http://schemas.microsoft.com/office/word/2010/wordprocessingCanvas" xmlns:mo="http://schemas.microsoft.com/office/mac/office/2008/main" xmlns:mc="http://schemas.openxmlformats.org/markup-compatibility/2006" xmlns:mv="urn:schemas-microsoft-com:mac:vml" xmlns:o="urn:schemas-microsoft-com:office:office" xmlns:r="http://schemas.openxmlformats.org/officeDocument/2006/relationships" xmlns:m="http://schemas.openxmlformats.org/officeDocument/2006/math" xmlns:v="urn:schemas-microsoft-com:vml" xmlns:wp14="http://schemas.microsoft.com/office/word/2010/wordprocessingDrawing" xmlns:wp="http://schemas.openxmlformats.org/drawingml/2006/wordprocessingDrawing" xmlns:w10="urn:schemas-microsoft-com:office:word" xmlns:w="http://schemas.openxmlformats.org/wordprocessingml/2006/main" xmlns:w14="http://schemas.microsoft.com/office/word/2010/wordml" xmlns:wpg="http://schemas.microsoft.com/office/word/2010/wordprocessingGroup" xmlns:wpi="http://schemas.microsoft.com/office/word/2010/wordprocessingInk" xmlns:wne="http://schemas.microsoft.com/office/word/2006/wordml" xmlns:wps="http://schemas.microsoft.com/office/word/2010/wordprocessingShape" mc:Ignorable="w14 wp14">
+<w:styles xmlns:wpc="http://schemas.microsoft.com/office/word/2010/wordprocessingCanvas" xmlns:mc="http://schemas.openxmlformats.org/markup-compatibility/2006" xmlns:o="urn:schemas-microsoft-com:office:office" xmlns:r="http://schemas.openxmlformats.org/officeDocument/2006/relationships" xmlns:m="http://schemas.openxmlformats.org/officeDocument/2006/math" xmlns:v="urn:schemas-microsoft-com:vml" xmlns:wp14="http://schemas.microsoft.com/office/word/2010/wordprocessingDrawing" xmlns:wp="http://schemas.openxmlformats.org/drawingml/2006/wordprocessingDrawing" xmlns:w10="urn:schemas-microsoft-com:office:word" xmlns:w="http://schemas.openxmlformats.org/wordprocessingml/2006/main" xmlns:w14="http://schemas.microsoft.com/office/word/2010/wordml" xmlns:wpg="http://schemas.microsoft.com/office/word/2010/wordprocessingGroup" xmlns:wpi="http://schemas.microsoft.com/office/word/2010/wordprocessingInk" xmlns:wne="http://schemas.microsoft.com/office/word/2006/wordml" xmlns:wps="http://schemas.microsoft.com/office/word/2010/wordprocessingShape" mc:Ignorable="w14 wp14">
   <w:docDefaults>
     <w:rPrDefault>
       <w:rPr>
@@ -12294,7 +12355,7 @@
       </w:pPr>
     </w:pPrDefault>
   </w:docDefaults>
-  <w:latentStyles w:defLockedState="0" w:defUIPriority="99" w:defSemiHidden="1" w:defUnhideWhenUsed="1" w:defQFormat="0" w:count="276">
+  <w:latentStyles w:defLockedState="0" w:defUIPriority="99" w:defSemiHidden="1" w:defUnhideWhenUsed="1" w:defQFormat="0" w:count="267">
     <w:lsdException w:name="Normal" w:semiHidden="0" w:uiPriority="0" w:unhideWhenUsed="0" w:qFormat="1"/>
     <w:lsdException w:name="heading 1" w:semiHidden="0" w:uiPriority="9" w:unhideWhenUsed="0" w:qFormat="1"/>
     <w:lsdException w:name="heading 2" w:uiPriority="9" w:qFormat="1"/>
@@ -12673,6 +12734,50 @@
     <w:uiPriority w:val="99"/>
     <w:semiHidden/>
     <w:unhideWhenUsed/>
+  </w:style>
+  <w:style w:type="paragraph" w:styleId="Header">
+    <w:name w:val="header"/>
+    <w:basedOn w:val="Normal"/>
+    <w:link w:val="HeaderChar"/>
+    <w:uiPriority w:val="99"/>
+    <w:unhideWhenUsed/>
+    <w:rsid w:val="00E618BF"/>
+    <w:pPr>
+      <w:tabs>
+        <w:tab w:val="center" w:pos="4680"/>
+        <w:tab w:val="right" w:pos="9360"/>
+      </w:tabs>
+      <w:spacing w:after="0" w:line="240" w:lineRule="auto"/>
+    </w:pPr>
+  </w:style>
+  <w:style w:type="character" w:customStyle="1" w:styleId="HeaderChar">
+    <w:name w:val="Header Char"/>
+    <w:basedOn w:val="DefaultParagraphFont"/>
+    <w:link w:val="Header"/>
+    <w:uiPriority w:val="99"/>
+    <w:rsid w:val="00E618BF"/>
+  </w:style>
+  <w:style w:type="paragraph" w:styleId="Footer">
+    <w:name w:val="footer"/>
+    <w:basedOn w:val="Normal"/>
+    <w:link w:val="FooterChar"/>
+    <w:uiPriority w:val="99"/>
+    <w:unhideWhenUsed/>
+    <w:rsid w:val="00E618BF"/>
+    <w:pPr>
+      <w:tabs>
+        <w:tab w:val="center" w:pos="4680"/>
+        <w:tab w:val="right" w:pos="9360"/>
+      </w:tabs>
+      <w:spacing w:after="0" w:line="240" w:lineRule="auto"/>
+    </w:pPr>
+  </w:style>
+  <w:style w:type="character" w:customStyle="1" w:styleId="FooterChar">
+    <w:name w:val="Footer Char"/>
+    <w:basedOn w:val="DefaultParagraphFont"/>
+    <w:link w:val="Footer"/>
+    <w:uiPriority w:val="99"/>
+    <w:rsid w:val="00E618BF"/>
   </w:style>
   <w:style w:type="paragraph" w:styleId="NoSpacing">
     <w:name w:val="No Spacing"/>
@@ -24404,7 +24509,7 @@
 </file>
 
 <file path=customXml/itemProps1.xml><?xml version="1.0" encoding="utf-8"?>
-<ds:datastoreItem xmlns:ds="http://schemas.openxmlformats.org/officeDocument/2006/customXml" ds:itemID="{EF278816-EC6F-A645-907D-7F25AECB1D4A}">
+<ds:datastoreItem xmlns:ds="http://schemas.openxmlformats.org/officeDocument/2006/customXml" ds:itemID="{1638B336-7A01-4B73-A414-24CF43E12ED5}">
   <ds:schemaRefs>
     <ds:schemaRef ds:uri="http://schemas.openxmlformats.org/officeDocument/2006/bibliography"/>
   </ds:schemaRefs>

</xml_diff>